<commit_message>
Add exercise workbook and trainer guide for the ECC-2:2024 course
Trainee workbook (12 exercises on the fictional entity): the deck's eight
exercises rebuilt as full scenarios with realistic exhibits and answer
sheets, plus four extra exercises on asset reconciliation, vulnerability
deadlines, media disposal and the committee dashboard.

Trainer guide (trainer-only folder): purpose, scenario design and planted
traps, model answers with the reasoning, official control text, accepted
alternatives, common mistakes and a 100-point rubric per exercise.

Figures are computed from shared data, control codes are checked against
the official text, and no solution text appears in the trainee file.

Co-Authored-By: Claude Opus 5.5 <noreply@anthropic.com>
Claude-Session: https://claude.ai/code/session_017KDotA7czqmM3dopZEyKjC
</commit_message>
<xml_diff>
--- a/ECC-2-2024_course/04_ملفات_المدرب_فقط/README_المرفقات.docx
+++ b/ECC-2-2024_course/04_ملفات_المدرب_فقط/README_المرفقات.docx
@@ -1872,6 +1872,196 @@
                 <w:sz w:val="18"/>
                 <w:szCs w:val="18"/>
               </w:rPr>
+              <w:t>03_ملفات_المتدرب ← 06_كراسة_التمارين ← كراسة_التمارين_التطبيقية.docx</w:t>
+            </w:r>
+          </w:p>
+        </w:tc>
+        <w:tc>
+          <w:tcPr>
+            <w:tcW w:type="dxa" w:w="3969"/>
+          </w:tcPr>
+          <w:p>
+            <w:pPr>
+              <w:bidi/>
+              <w:spacing w:after="20" w:line="252" w:lineRule="auto"/>
+            </w:pPr>
+            <w:r/>
+            <w:r>
+              <w:rPr>
+                <w:rFonts w:ascii="Arial" w:hAnsi="Arial" w:cs="Arial" w:eastAsia="Arial"/>
+                <w:b w:val="0"/>
+                <w:bCs w:val="0"/>
+                <w:sz w:val="18"/>
+                <w:szCs w:val="18"/>
+              </w:rPr>
+              <w:t>اثنا عشر تمريناً بسيناريوهات ومستندات وأوراق إجابة: تمارين العرض الثمانية مكتملة، وأربعة إضافية</w:t>
+            </w:r>
+          </w:p>
+        </w:tc>
+        <w:tc>
+          <w:tcPr>
+            <w:tcW w:type="dxa" w:w="1247"/>
+          </w:tcPr>
+          <w:p>
+            <w:pPr>
+              <w:bidi/>
+              <w:spacing w:after="20" w:line="252" w:lineRule="auto"/>
+            </w:pPr>
+            <w:r/>
+            <w:r>
+              <w:rPr>
+                <w:rFonts w:ascii="Arial" w:hAnsi="Arial" w:cs="Arial" w:eastAsia="Arial"/>
+                <w:b w:val="0"/>
+                <w:bCs w:val="0"/>
+                <w:sz w:val="18"/>
+                <w:szCs w:val="18"/>
+              </w:rPr>
+              <w:t>المتدرب</w:t>
+            </w:r>
+          </w:p>
+        </w:tc>
+        <w:tc>
+          <w:tcPr>
+            <w:tcW w:type="dxa" w:w="1247"/>
+          </w:tcPr>
+          <w:p>
+            <w:pPr>
+              <w:bidi/>
+              <w:spacing w:after="20" w:line="252" w:lineRule="auto"/>
+            </w:pPr>
+            <w:r/>
+            <w:r>
+              <w:rPr>
+                <w:rFonts w:ascii="Arial" w:hAnsi="Arial" w:cs="Arial" w:eastAsia="Arial"/>
+                <w:b w:val="0"/>
+                <w:bCs w:val="0"/>
+                <w:sz w:val="18"/>
+                <w:szCs w:val="18"/>
+              </w:rPr>
+              <w:t>طوال الكورس</w:t>
+            </w:r>
+          </w:p>
+        </w:tc>
+      </w:tr>
+      <w:tr>
+        <w:trPr>
+          <w:cantSplit/>
+        </w:trPr>
+        <w:tc>
+          <w:tcPr>
+            <w:tcW w:type="dxa" w:w="3175"/>
+            <w:shd w:val="clear" w:color="auto" w:fill="FDECEC"/>
+          </w:tcPr>
+          <w:p>
+            <w:pPr>
+              <w:bidi/>
+              <w:spacing w:after="20" w:line="252" w:lineRule="auto"/>
+            </w:pPr>
+            <w:r/>
+            <w:r>
+              <w:rPr>
+                <w:rFonts w:ascii="Arial" w:hAnsi="Arial" w:cs="Arial" w:eastAsia="Arial"/>
+                <w:b w:val="0"/>
+                <w:bCs w:val="0"/>
+                <w:sz w:val="18"/>
+                <w:szCs w:val="18"/>
+              </w:rPr>
+              <w:t>04_ملفات_المدرب_فقط ← 06_كراسة_التمارين ← دليل_المدرب_شرح_التمارين_والحلول.docx</w:t>
+            </w:r>
+          </w:p>
+        </w:tc>
+        <w:tc>
+          <w:tcPr>
+            <w:tcW w:type="dxa" w:w="3969"/>
+            <w:shd w:val="clear" w:color="auto" w:fill="FDECEC"/>
+          </w:tcPr>
+          <w:p>
+            <w:pPr>
+              <w:bidi/>
+              <w:spacing w:after="20" w:line="252" w:lineRule="auto"/>
+            </w:pPr>
+            <w:r/>
+            <w:r>
+              <w:rPr>
+                <w:rFonts w:ascii="Arial" w:hAnsi="Arial" w:cs="Arial" w:eastAsia="Arial"/>
+                <w:b w:val="0"/>
+                <w:bCs w:val="0"/>
+                <w:sz w:val="18"/>
+                <w:szCs w:val="18"/>
+              </w:rPr>
+              <w:t>شرح كل تمرين: الحل، ولماذا، والفخاخ المقصودة، والبدائل المقبولة، ومعيار التصحيح</w:t>
+            </w:r>
+          </w:p>
+        </w:tc>
+        <w:tc>
+          <w:tcPr>
+            <w:tcW w:type="dxa" w:w="1247"/>
+            <w:shd w:val="clear" w:color="auto" w:fill="FDECEC"/>
+          </w:tcPr>
+          <w:p>
+            <w:pPr>
+              <w:bidi/>
+              <w:spacing w:after="20" w:line="252" w:lineRule="auto"/>
+            </w:pPr>
+            <w:r/>
+            <w:r>
+              <w:rPr>
+                <w:rFonts w:ascii="Arial" w:hAnsi="Arial" w:cs="Arial" w:eastAsia="Arial"/>
+                <w:b w:val="0"/>
+                <w:bCs w:val="0"/>
+                <w:sz w:val="18"/>
+                <w:szCs w:val="18"/>
+              </w:rPr>
+              <w:t>المدرب فقط</w:t>
+            </w:r>
+          </w:p>
+        </w:tc>
+        <w:tc>
+          <w:tcPr>
+            <w:tcW w:type="dxa" w:w="1247"/>
+            <w:shd w:val="clear" w:color="auto" w:fill="FDECEC"/>
+          </w:tcPr>
+          <w:p>
+            <w:pPr>
+              <w:bidi/>
+              <w:spacing w:after="20" w:line="252" w:lineRule="auto"/>
+            </w:pPr>
+            <w:r/>
+            <w:r>
+              <w:rPr>
+                <w:rFonts w:ascii="Arial" w:hAnsi="Arial" w:cs="Arial" w:eastAsia="Arial"/>
+                <w:b w:val="0"/>
+                <w:bCs w:val="0"/>
+                <w:sz w:val="18"/>
+                <w:szCs w:val="18"/>
+              </w:rPr>
+              <w:t>بعد التسليم</w:t>
+            </w:r>
+          </w:p>
+        </w:tc>
+      </w:tr>
+      <w:tr>
+        <w:trPr>
+          <w:cantSplit/>
+        </w:trPr>
+        <w:tc>
+          <w:tcPr>
+            <w:tcW w:type="dxa" w:w="3175"/>
+          </w:tcPr>
+          <w:p>
+            <w:pPr>
+              <w:bidi/>
+              <w:spacing w:after="20" w:line="252" w:lineRule="auto"/>
+            </w:pPr>
+            <w:r/>
+            <w:r>
+              <w:rPr>
+                <w:rFonts w:ascii="Arial" w:hAnsi="Arial" w:cs="Arial" w:eastAsia="Arial"/>
+                <w:b w:val="0"/>
+                <w:bCs w:val="0"/>
+                <w:sz w:val="18"/>
+                <w:szCs w:val="18"/>
+              </w:rPr>
               <w:t>03_ملفات_المتدرب ← 05_الاختبار_المعرفي ← أسئلة_الاختبار_المعرفي.docx</w:t>
             </w:r>
           </w:p>

</xml_diff>